<commit_message>
fin word module 5 Python
</commit_message>
<xml_diff>
--- a/Python/Les variables complexes_4.docx
+++ b/Python/Les variables complexes_4.docx
@@ -39,11 +39,20 @@
           <w:b/>
           <w:bCs/>
         </w:rPr>
-        <w:t>Les variables complexes</w:t>
+        <w:t xml:space="preserve">Les variables </w:t>
+      </w:r>
+      <w:proofErr w:type="gramStart"/>
+      <w:r>
+        <w:rPr>
+          <w:b/>
+          <w:bCs/>
+        </w:rPr>
+        <w:t>complexes</w:t>
       </w:r>
       <w:r>
         <w:t>»</w:t>
       </w:r>
+      <w:proofErr w:type="gramEnd"/>
       <w:r>
         <w:t xml:space="preserve"> </w:t>
       </w:r>
@@ -168,7 +177,7 @@
         </w:p>
         <w:p>
           <w:pPr>
-            <w:pStyle w:val="TM2"/>
+            <w:pStyle w:val="TM1"/>
             <w:tabs>
               <w:tab w:val="right" w:leader="dot" w:pos="9062"/>
             </w:tabs>
@@ -187,13 +196,13 @@
           <w:r>
             <w:fldChar w:fldCharType="separate"/>
           </w:r>
-          <w:hyperlink w:anchor="_Toc230679305" w:history="1">
+          <w:hyperlink w:anchor="_Toc231468730" w:history="1">
             <w:r>
               <w:rPr>
                 <w:rStyle w:val="Lienhypertexte"/>
                 <w:noProof/>
               </w:rPr>
-              <w:t>Exemples « d’Algo » dans la vie de tous les jours</w:t>
+              <w:t>Les types de données évoluées</w:t>
             </w:r>
             <w:r>
               <w:rPr>
@@ -214,7 +223,7 @@
                 <w:noProof/>
                 <w:webHidden/>
               </w:rPr>
-              <w:instrText xml:space="preserve"> PAGEREF _Toc230679305 \h </w:instrText>
+              <w:instrText xml:space="preserve"> PAGEREF _Toc231468730 \h </w:instrText>
             </w:r>
             <w:r>
               <w:rPr>
@@ -257,13 +266,13 @@
               <w:lang w:eastAsia="fr-FR"/>
             </w:rPr>
           </w:pPr>
-          <w:hyperlink w:anchor="_Toc230679306" w:history="1">
+          <w:hyperlink w:anchor="_Toc231468731" w:history="1">
             <w:r>
               <w:rPr>
                 <w:rStyle w:val="Lienhypertexte"/>
                 <w:noProof/>
               </w:rPr>
-              <w:t>Définition et objectif de l’algorithmique</w:t>
+              <w:t>Démonstration - Le n-uplet (tuple)</w:t>
             </w:r>
             <w:r>
               <w:rPr>
@@ -284,7 +293,7 @@
                 <w:noProof/>
                 <w:webHidden/>
               </w:rPr>
-              <w:instrText xml:space="preserve"> PAGEREF _Toc230679306 \h </w:instrText>
+              <w:instrText xml:space="preserve"> PAGEREF _Toc231468731 \h </w:instrText>
             </w:r>
             <w:r>
               <w:rPr>
@@ -304,147 +313,7 @@
                 <w:noProof/>
                 <w:webHidden/>
               </w:rPr>
-              <w:t>5</w:t>
-            </w:r>
-            <w:r>
-              <w:rPr>
-                <w:noProof/>
-                <w:webHidden/>
-              </w:rPr>
-              <w:fldChar w:fldCharType="end"/>
-            </w:r>
-          </w:hyperlink>
-        </w:p>
-        <w:p>
-          <w:pPr>
-            <w:pStyle w:val="TM1"/>
-            <w:tabs>
-              <w:tab w:val="right" w:leader="dot" w:pos="9062"/>
-            </w:tabs>
-            <w:rPr>
-              <w:rFonts w:eastAsiaTheme="minorEastAsia"/>
-              <w:noProof/>
-              <w:lang w:eastAsia="fr-FR"/>
-            </w:rPr>
-          </w:pPr>
-          <w:hyperlink w:anchor="_Toc230679307" w:history="1">
-            <w:r>
-              <w:rPr>
-                <w:rStyle w:val="Lienhypertexte"/>
-                <w:noProof/>
-              </w:rPr>
-              <w:t>Buts de l’algorithmique</w:t>
-            </w:r>
-            <w:r>
-              <w:rPr>
-                <w:noProof/>
-                <w:webHidden/>
-              </w:rPr>
-              <w:tab/>
-            </w:r>
-            <w:r>
-              <w:rPr>
-                <w:noProof/>
-                <w:webHidden/>
-              </w:rPr>
-              <w:fldChar w:fldCharType="begin"/>
-            </w:r>
-            <w:r>
-              <w:rPr>
-                <w:noProof/>
-                <w:webHidden/>
-              </w:rPr>
-              <w:instrText xml:space="preserve"> PAGEREF _Toc230679307 \h </w:instrText>
-            </w:r>
-            <w:r>
-              <w:rPr>
-                <w:noProof/>
-                <w:webHidden/>
-              </w:rPr>
-            </w:r>
-            <w:r>
-              <w:rPr>
-                <w:noProof/>
-                <w:webHidden/>
-              </w:rPr>
-              <w:fldChar w:fldCharType="separate"/>
-            </w:r>
-            <w:r>
-              <w:rPr>
-                <w:noProof/>
-                <w:webHidden/>
-              </w:rPr>
-              <w:t>5</w:t>
-            </w:r>
-            <w:r>
-              <w:rPr>
-                <w:noProof/>
-                <w:webHidden/>
-              </w:rPr>
-              <w:fldChar w:fldCharType="end"/>
-            </w:r>
-          </w:hyperlink>
-        </w:p>
-        <w:p>
-          <w:pPr>
-            <w:pStyle w:val="TM1"/>
-            <w:tabs>
-              <w:tab w:val="right" w:leader="dot" w:pos="9062"/>
-            </w:tabs>
-            <w:rPr>
-              <w:rFonts w:eastAsiaTheme="minorEastAsia"/>
-              <w:noProof/>
-              <w:lang w:eastAsia="fr-FR"/>
-            </w:rPr>
-          </w:pPr>
-          <w:hyperlink w:anchor="_Toc230679308" w:history="1">
-            <w:r>
-              <w:rPr>
-                <w:rStyle w:val="Lienhypertexte"/>
-                <w:noProof/>
-              </w:rPr>
-              <w:t>Pourquoi l’algorithmique</w:t>
-            </w:r>
-            <w:r>
-              <w:rPr>
-                <w:noProof/>
-                <w:webHidden/>
-              </w:rPr>
-              <w:tab/>
-            </w:r>
-            <w:r>
-              <w:rPr>
-                <w:noProof/>
-                <w:webHidden/>
-              </w:rPr>
-              <w:fldChar w:fldCharType="begin"/>
-            </w:r>
-            <w:r>
-              <w:rPr>
-                <w:noProof/>
-                <w:webHidden/>
-              </w:rPr>
-              <w:instrText xml:space="preserve"> PAGEREF _Toc230679308 \h </w:instrText>
-            </w:r>
-            <w:r>
-              <w:rPr>
-                <w:noProof/>
-                <w:webHidden/>
-              </w:rPr>
-            </w:r>
-            <w:r>
-              <w:rPr>
-                <w:noProof/>
-                <w:webHidden/>
-              </w:rPr>
-              <w:fldChar w:fldCharType="separate"/>
-            </w:r>
-            <w:r>
-              <w:rPr>
-                <w:noProof/>
-                <w:webHidden/>
-              </w:rPr>
-              <w:t>6</w:t>
+              <w:t>3</w:t>
             </w:r>
             <w:r>
               <w:rPr>
@@ -539,10 +408,12 @@
       <w:pPr>
         <w:pStyle w:val="Titre1"/>
       </w:pPr>
+      <w:bookmarkStart w:id="0" w:name="_Toc231468730"/>
       <w:r>
         <w:lastRenderedPageBreak/>
         <w:t>Les types de données évoluées</w:t>
       </w:r>
+      <w:bookmarkEnd w:id="0"/>
     </w:p>
     <w:p>
       <w:r>
@@ -591,9 +462,11 @@
       <w:pPr>
         <w:pStyle w:val="Titre1"/>
       </w:pPr>
+      <w:bookmarkStart w:id="1" w:name="_Toc231468731"/>
       <w:r>
         <w:t>Démonstration - Le n-uplet (tuple)</w:t>
       </w:r>
+      <w:bookmarkEnd w:id="1"/>
     </w:p>
     <w:p>
       <w:r>
@@ -615,7 +488,15 @@
         <w:t xml:space="preserve"> </w:t>
       </w:r>
       <w:r>
-        <w:t xml:space="preserve">dans votre espace de travail (WorkSpace), vous allez créer un nouveau fichier Python que l’on pourrait nommer </w:t>
+        <w:t>dans votre espace de travail (</w:t>
+      </w:r>
+      <w:proofErr w:type="spellStart"/>
+      <w:r>
+        <w:t>WorkSpace</w:t>
+      </w:r>
+      <w:proofErr w:type="spellEnd"/>
+      <w:r>
+        <w:t xml:space="preserve">), vous allez créer un nouveau fichier Python que l’on pourrait nommer </w:t>
       </w:r>
     </w:p>
     <w:p>

</xml_diff>